<commit_message>
ip config end devices
</commit_message>
<xml_diff>
--- a/2026/Практика 3/Практика3.docx
+++ b/2026/Практика 3/Практика3.docx
@@ -69,10 +69,38 @@
     <w:p>
       <w:pPr>
         <w:pStyle w:val="ac"/>
+        <w:rPr>
+          <w:lang w:val="en-US"/>
+        </w:rPr>
       </w:pPr>
       <w:r>
         <w:t>Рисунок 1. Общая топология</w:t>
       </w:r>
+    </w:p>
+    <w:p>
+      <w:pPr>
+        <w:pStyle w:val="a5"/>
+      </w:pPr>
+      <w:r>
+        <w:t xml:space="preserve">Потом была настроена вся </w:t>
+      </w:r>
+      <w:r>
+        <w:rPr>
+          <w:lang w:val="en-US"/>
+        </w:rPr>
+        <w:t>ip</w:t>
+      </w:r>
+      <w:r>
+        <w:t>-</w:t>
+      </w:r>
+      <w:r>
+        <w:t>конфигурация на устройствах.</w:t>
+      </w:r>
+    </w:p>
+    <w:p>
+      <w:pPr>
+        <w:pStyle w:val="a5"/>
+      </w:pPr>
     </w:p>
     <w:sectPr>
       <w:pgSz w:w="11906" w:h="16838"/>

</xml_diff>

<commit_message>
left side pings work
</commit_message>
<xml_diff>
--- a/2026/Практика 3/Практика3.docx
+++ b/2026/Практика 3/Практика3.docx
@@ -80,26 +80,81 @@
     <w:p>
       <w:pPr>
         <w:pStyle w:val="a5"/>
+        <w:ind w:firstLine="0"/>
+        <w:jc w:val="center"/>
+        <w:rPr>
+          <w:lang w:val="en-US"/>
+        </w:rPr>
       </w:pPr>
       <w:r>
-        <w:t xml:space="preserve">Потом была настроена вся </w:t>
+        <w:drawing>
+          <wp:inline distT="0" distB="0" distL="0" distR="0" wp14:anchorId="7E8C334F" wp14:editId="42879D28">
+            <wp:extent cx="4620324" cy="3423139"/>
+            <wp:effectExtent l="0" t="0" r="8890" b="6350"/>
+            <wp:docPr id="445669168" name="Рисунок 1"/>
+            <wp:cNvGraphicFramePr>
+              <a:graphicFrameLocks xmlns:a="http://schemas.openxmlformats.org/drawingml/2006/main" noChangeAspect="1"/>
+            </wp:cNvGraphicFramePr>
+            <a:graphic xmlns:a="http://schemas.openxmlformats.org/drawingml/2006/main">
+              <a:graphicData uri="http://schemas.openxmlformats.org/drawingml/2006/picture">
+                <pic:pic xmlns:pic="http://schemas.openxmlformats.org/drawingml/2006/picture">
+                  <pic:nvPicPr>
+                    <pic:cNvPr id="445669168" name=""/>
+                    <pic:cNvPicPr/>
+                  </pic:nvPicPr>
+                  <pic:blipFill>
+                    <a:blip r:embed="rId5"/>
+                    <a:stretch>
+                      <a:fillRect/>
+                    </a:stretch>
+                  </pic:blipFill>
+                  <pic:spPr>
+                    <a:xfrm>
+                      <a:off x="0" y="0"/>
+                      <a:ext cx="4621633" cy="3424109"/>
+                    </a:xfrm>
+                    <a:prstGeom prst="rect">
+                      <a:avLst/>
+                    </a:prstGeom>
+                  </pic:spPr>
+                </pic:pic>
+              </a:graphicData>
+            </a:graphic>
+          </wp:inline>
+        </w:drawing>
+      </w:r>
+    </w:p>
+    <w:p>
+      <w:pPr>
+        <w:pStyle w:val="ac"/>
+        <w:rPr>
+          <w:lang w:val="en-US"/>
+        </w:rPr>
+      </w:pPr>
+      <w:r>
+        <w:t xml:space="preserve">Рисунок </w:t>
       </w:r>
       <w:r>
         <w:rPr>
           <w:lang w:val="en-US"/>
         </w:rPr>
-        <w:t>ip</w:t>
+        <w:t>2</w:t>
       </w:r>
       <w:r>
-        <w:t>-</w:t>
+        <w:t xml:space="preserve">. </w:t>
       </w:r>
       <w:r>
-        <w:t>конфигурация на устройствах.</w:t>
+        <w:t>Левая часть</w:t>
       </w:r>
     </w:p>
     <w:p>
       <w:pPr>
         <w:pStyle w:val="a5"/>
+        <w:ind w:firstLine="0"/>
+        <w:jc w:val="center"/>
+        <w:rPr>
+          <w:lang w:val="en-US"/>
+        </w:rPr>
       </w:pPr>
     </w:p>
     <w:sectPr>

</xml_diff>